<commit_message>
docs: replace seminar evidence with GitHub screenshots
</commit_message>
<xml_diff>
--- a/docs/advanced-seminar/LexChain-Advanced-Seminar.docx
+++ b/docs/advanced-seminar/LexChain-Advanced-Seminar.docx
@@ -74,7 +74,7 @@
     </w:p>
     <w:p>
       <w:r>
-        <w:t>The task branch was created from the fetched origin/main at 40923b1. Repository guidance and docs/adr/0001-main-dev-branch-flow.md identify main as the released source of truth and dev as the integration branch, so main was selected as the base. The branch remains local; its GitHub link will resolve after it is pushed. An isolated worktree kept the unrelated changes in the original dev checkout untouched.</w:t>
+        <w:t>The task branch was created from the fetched origin/main at 40923b1. Repository guidance and docs/adr/0001-main-dev-branch-flow.md identify main as the released source of truth and dev as the integration branch, so main was selected as the base. The branch was pushed to GitHub after commit, and the linked branch page shows its files. An isolated worktree kept the unrelated changes in the original dev checkout untouched.</w:t>
       </w:r>
     </w:p>
     <w:p>
@@ -183,17 +183,13 @@
     </w:p>
     <w:p>
       <w:r>
-        <w:t>Evidence screenshots are direct Playwright captures of local Git command output and the actual AGENTS.md and SKILL.md contents. Text was displayed at a larger browser font for readability; the screenshot content was not edited. No credentials or tokens are included.</w:t>
-      </w:r>
-    </w:p>
-    <w:p>
-      <w:r>
-        <w:br w:type="page"/>
+        <w:t>Evidence screenshots are direct browser captures of GitHub pages on the pushed task branch. They show the branch and committed files, the skills directory, root AGENTS.md links, both LexChain skills, and the provider skill. Screenshots were not altered, and no credentials or tokens are visible.</w:t>
       </w:r>
     </w:p>
     <w:p>
       <w:pPr>
         <w:pStyle w:val="Heading1"/>
+        <w:pageBreakBefore/>
       </w:pPr>
       <w:r>
         <w:t>Evidence</w:t>
@@ -201,14 +197,15 @@
     </w:p>
     <w:p>
       <w:pPr>
+        <w:keepNext/>
         <w:keepLines/>
         <w:spacing w:after="60"/>
       </w:pPr>
       <w:r>
         <w:drawing>
           <wp:inline xmlns:a="http://schemas.openxmlformats.org/drawingml/2006/main" xmlns:pic="http://schemas.openxmlformats.org/drawingml/2006/picture">
-            <wp:extent cx="6583680" cy="2370125"/>
-            <wp:docPr id="1" name="Picture 1" descr="Figure 1. Local Git output showing the task branch, origin/main base, and ancestry check."/>
+            <wp:extent cx="6583680" cy="5145146"/>
+            <wp:docPr id="6" name="Picture 6"/>
             <wp:cNvGraphicFramePr>
               <a:graphicFrameLocks noChangeAspect="1"/>
             </wp:cNvGraphicFramePr>
@@ -216,11 +213,11 @@
               <a:graphicData uri="http://schemas.openxmlformats.org/drawingml/2006/picture">
                 <pic:pic>
                   <pic:nvPicPr>
-                    <pic:cNvPr id="0" name="01-branch-base.png"/>
+                    <pic:cNvPr id="0" name="01-github-branch.png"/>
                     <pic:cNvPicPr/>
                   </pic:nvPicPr>
                   <pic:blipFill>
-                    <a:blip r:embed="rId13"/>
+                    <a:blip r:embed="rId18"/>
                     <a:stretch>
                       <a:fillRect/>
                     </a:stretch>
@@ -228,7 +225,7 @@
                   <pic:spPr>
                     <a:xfrm>
                       <a:off x="0" y="0"/>
-                      <a:ext cx="6583680" cy="2370125"/>
+                      <a:ext cx="6583680" cy="5145146"/>
                     </a:xfrm>
                     <a:prstGeom prst="rect"/>
                   </pic:spPr>
@@ -246,23 +243,20 @@
         <w:jc w:val="center"/>
       </w:pPr>
       <w:r>
-        <w:rPr>
-          <w:rFonts w:ascii="Arial" w:hAnsi="Arial" w:eastAsia="Arial" w:cs="Arial"/>
-          <w:sz w:val="24"/>
-        </w:rPr>
-        <w:t>Figure 1. Local Git output showing the task branch, origin/main base, and ancestry check.</w:t>
+        <w:t>Figure 1. GitHub branch page showing the pushed task branch and committed files.</w:t>
       </w:r>
     </w:p>
     <w:p>
       <w:pPr>
+        <w:keepNext/>
         <w:keepLines/>
         <w:spacing w:after="60"/>
       </w:pPr>
       <w:r>
         <w:drawing>
           <wp:inline xmlns:a="http://schemas.openxmlformats.org/drawingml/2006/main" xmlns:pic="http://schemas.openxmlformats.org/drawingml/2006/picture">
-            <wp:extent cx="6583680" cy="2765146"/>
-            <wp:docPr id="2" name="Picture 2" descr="Figure 2. Root AGENTS.md project skills section with links to the focused guidance."/>
+            <wp:extent cx="6583680" cy="5145146"/>
+            <wp:docPr id="7" name="Picture 7"/>
             <wp:cNvGraphicFramePr>
               <a:graphicFrameLocks noChangeAspect="1"/>
             </wp:cNvGraphicFramePr>
@@ -270,11 +264,11 @@
               <a:graphicData uri="http://schemas.openxmlformats.org/drawingml/2006/picture">
                 <pic:pic>
                   <pic:nvPicPr>
-                    <pic:cNvPr id="0" name="02-agents-guidance.png"/>
+                    <pic:cNvPr id="0" name="02-github-skills-directory.png"/>
                     <pic:cNvPicPr/>
                   </pic:nvPicPr>
                   <pic:blipFill>
-                    <a:blip r:embed="rId14"/>
+                    <a:blip r:embed="rId19"/>
                     <a:stretch>
                       <a:fillRect/>
                     </a:stretch>
@@ -282,7 +276,7 @@
                   <pic:spPr>
                     <a:xfrm>
                       <a:off x="0" y="0"/>
-                      <a:ext cx="6583680" cy="2765146"/>
+                      <a:ext cx="6583680" cy="5145146"/>
                     </a:xfrm>
                     <a:prstGeom prst="rect"/>
                   </pic:spPr>
@@ -300,11 +294,7 @@
         <w:jc w:val="center"/>
       </w:pPr>
       <w:r>
-        <w:rPr>
-          <w:rFonts w:ascii="Arial" w:hAnsi="Arial" w:eastAsia="Arial" w:cs="Arial"/>
-          <w:sz w:val="24"/>
-        </w:rPr>
-        <w:t>Figure 2. Root AGENTS.md project skills section with links to the focused guidance.</w:t>
+        <w:t>Figure 2. GitHub .agents/skills directory listing the three project skills.</w:t>
       </w:r>
     </w:p>
     <w:p>
@@ -314,14 +304,15 @@
     </w:p>
     <w:p>
       <w:pPr>
+        <w:keepNext/>
         <w:keepLines/>
         <w:spacing w:after="60"/>
       </w:pPr>
       <w:r>
         <w:drawing>
           <wp:inline xmlns:a="http://schemas.openxmlformats.org/drawingml/2006/main" xmlns:pic="http://schemas.openxmlformats.org/drawingml/2006/picture">
-            <wp:extent cx="6583680" cy="7696322"/>
-            <wp:docPr id="3" name="Picture 3" descr="Figure 3. LexChain document workflows skill: scope, workflow, boundaries, and useful result."/>
+            <wp:extent cx="6583680" cy="4733666"/>
+            <wp:docPr id="8" name="Picture 8"/>
             <wp:cNvGraphicFramePr>
               <a:graphicFrameLocks noChangeAspect="1"/>
             </wp:cNvGraphicFramePr>
@@ -329,11 +320,11 @@
               <a:graphicData uri="http://schemas.openxmlformats.org/drawingml/2006/picture">
                 <pic:pic>
                   <pic:nvPicPr>
-                    <pic:cNvPr id="0" name="03-document-workflows-skill.png"/>
+                    <pic:cNvPr id="0" name="03-github-agents-guidance.png"/>
                     <pic:cNvPicPr/>
                   </pic:nvPicPr>
                   <pic:blipFill>
-                    <a:blip r:embed="rId15"/>
+                    <a:blip r:embed="rId20"/>
                     <a:stretch>
                       <a:fillRect/>
                     </a:stretch>
@@ -341,7 +332,7 @@
                   <pic:spPr>
                     <a:xfrm>
                       <a:off x="0" y="0"/>
-                      <a:ext cx="6583680" cy="7696322"/>
+                      <a:ext cx="6583680" cy="4733666"/>
                     </a:xfrm>
                     <a:prstGeom prst="rect"/>
                   </pic:spPr>
@@ -359,11 +350,7 @@
         <w:jc w:val="center"/>
       </w:pPr>
       <w:r>
-        <w:rPr>
-          <w:rFonts w:ascii="Arial" w:hAnsi="Arial" w:eastAsia="Arial" w:cs="Arial"/>
-          <w:sz w:val="24"/>
-        </w:rPr>
-        <w:t>Figure 3. LexChain document workflows skill: scope, workflow, boundaries, and useful result.</w:t>
+        <w:t>Figure 3. Root AGENTS.md Project skills section on GitHub.</w:t>
       </w:r>
     </w:p>
     <w:p>
@@ -373,14 +360,15 @@
     </w:p>
     <w:p>
       <w:pPr>
+        <w:keepNext/>
         <w:keepLines/>
         <w:spacing w:after="60"/>
       </w:pPr>
       <w:r>
         <w:drawing>
           <wp:inline xmlns:a="http://schemas.openxmlformats.org/drawingml/2006/main" xmlns:pic="http://schemas.openxmlformats.org/drawingml/2006/picture">
-            <wp:extent cx="6583680" cy="8196682"/>
-            <wp:docPr id="4" name="Picture 4" descr="Figure 4. LexChain API integration skill: caller path, contract workflow, and boundaries."/>
+            <wp:extent cx="6583680" cy="6791066"/>
+            <wp:docPr id="9" name="Picture 9"/>
             <wp:cNvGraphicFramePr>
               <a:graphicFrameLocks noChangeAspect="1"/>
             </wp:cNvGraphicFramePr>
@@ -388,11 +376,11 @@
               <a:graphicData uri="http://schemas.openxmlformats.org/drawingml/2006/picture">
                 <pic:pic>
                   <pic:nvPicPr>
-                    <pic:cNvPr id="0" name="04-api-integration-skill.png"/>
+                    <pic:cNvPr id="0" name="04-github-document-workflows.png"/>
                     <pic:cNvPicPr/>
                   </pic:nvPicPr>
                   <pic:blipFill>
-                    <a:blip r:embed="rId16"/>
+                    <a:blip r:embed="rId21"/>
                     <a:stretch>
                       <a:fillRect/>
                     </a:stretch>
@@ -400,7 +388,7 @@
                   <pic:spPr>
                     <a:xfrm>
                       <a:off x="0" y="0"/>
-                      <a:ext cx="6583680" cy="8196682"/>
+                      <a:ext cx="6583680" cy="6791066"/>
                     </a:xfrm>
                     <a:prstGeom prst="rect"/>
                   </pic:spPr>
@@ -418,11 +406,7 @@
         <w:jc w:val="center"/>
       </w:pPr>
       <w:r>
-        <w:rPr>
-          <w:rFonts w:ascii="Arial" w:hAnsi="Arial" w:eastAsia="Arial" w:cs="Arial"/>
-          <w:sz w:val="24"/>
-        </w:rPr>
-        <w:t>Figure 4. LexChain API integration skill: caller path, contract workflow, and boundaries.</w:t>
+        <w:t>Figure 4. LexChain document workflows skill on GitHub.</w:t>
       </w:r>
     </w:p>
     <w:p>
@@ -432,14 +416,15 @@
     </w:p>
     <w:p>
       <w:pPr>
+        <w:keepNext/>
         <w:keepLines/>
         <w:spacing w:after="60"/>
       </w:pPr>
       <w:r>
         <w:drawing>
           <wp:inline xmlns:a="http://schemas.openxmlformats.org/drawingml/2006/main" xmlns:pic="http://schemas.openxmlformats.org/drawingml/2006/picture">
-            <wp:extent cx="6583680" cy="5266944"/>
-            <wp:docPr id="5" name="Picture 5" descr="Figure 5. Vercel React Best Practices source frontmatter, application scope, and license."/>
+            <wp:extent cx="6583680" cy="6791066"/>
+            <wp:docPr id="10" name="Picture 10"/>
             <wp:cNvGraphicFramePr>
               <a:graphicFrameLocks noChangeAspect="1"/>
             </wp:cNvGraphicFramePr>
@@ -447,11 +432,11 @@
               <a:graphicData uri="http://schemas.openxmlformats.org/drawingml/2006/picture">
                 <pic:pic>
                   <pic:nvPicPr>
-                    <pic:cNvPr id="0" name="05-provider-skill.png"/>
+                    <pic:cNvPr id="0" name="05-github-api-integration.png"/>
                     <pic:cNvPicPr/>
                   </pic:nvPicPr>
                   <pic:blipFill>
-                    <a:blip r:embed="rId17"/>
+                    <a:blip r:embed="rId22"/>
                     <a:stretch>
                       <a:fillRect/>
                     </a:stretch>
@@ -459,7 +444,7 @@
                   <pic:spPr>
                     <a:xfrm>
                       <a:off x="0" y="0"/>
-                      <a:ext cx="6583680" cy="5266944"/>
+                      <a:ext cx="6583680" cy="6791066"/>
                     </a:xfrm>
                     <a:prstGeom prst="rect"/>
                   </pic:spPr>
@@ -477,11 +462,52 @@
         <w:jc w:val="center"/>
       </w:pPr>
       <w:r>
-        <w:rPr>
-          <w:rFonts w:ascii="Arial" w:hAnsi="Arial" w:eastAsia="Arial" w:cs="Arial"/>
-          <w:sz w:val="24"/>
-        </w:rPr>
-        <w:t>Figure 5. Vercel React Best Practices source frontmatter, application scope, and license.</w:t>
+        <w:t>Figure 5. LexChain API integration skill on GitHub.</w:t>
+      </w:r>
+    </w:p>
+    <w:p>
+      <w:pPr>
+        <w:keepNext/>
+      </w:pPr>
+      <w:r>
+        <w:drawing>
+          <wp:inline xmlns:a="http://schemas.openxmlformats.org/drawingml/2006/main" xmlns:pic="http://schemas.openxmlformats.org/drawingml/2006/picture">
+            <wp:extent cx="6583680" cy="5145146"/>
+            <wp:docPr id="11" name="Picture 11"/>
+            <wp:cNvGraphicFramePr>
+              <a:graphicFrameLocks noChangeAspect="1"/>
+            </wp:cNvGraphicFramePr>
+            <a:graphic>
+              <a:graphicData uri="http://schemas.openxmlformats.org/drawingml/2006/picture">
+                <pic:pic>
+                  <pic:nvPicPr>
+                    <pic:cNvPr id="0" name="06-github-vercel-provider-skill.png"/>
+                    <pic:cNvPicPr/>
+                  </pic:nvPicPr>
+                  <pic:blipFill>
+                    <a:blip r:embed="rId23"/>
+                    <a:stretch>
+                      <a:fillRect/>
+                    </a:stretch>
+                  </pic:blipFill>
+                  <pic:spPr>
+                    <a:xfrm>
+                      <a:off x="0" y="0"/>
+                      <a:ext cx="6583680" cy="5145146"/>
+                    </a:xfrm>
+                    <a:prstGeom prst="rect"/>
+                  </pic:spPr>
+                </pic:pic>
+              </a:graphicData>
+            </a:graphic>
+          </wp:inline>
+        </w:drawing>
+      </w:r>
+    </w:p>
+    <w:p>
+      <w:pPr/>
+      <w:r>
+        <w:t>Figure 6. Vercel React Best Practices provider skill on GitHub.</w:t>
       </w:r>
     </w:p>
     <w:sectPr>

</xml_diff>

<commit_message>
docs: simplify advanced seminar report wording
</commit_message>
<xml_diff>
--- a/docs/advanced-seminar/LexChain-Advanced-Seminar.docx
+++ b/docs/advanced-seminar/LexChain-Advanced-Seminar.docx
@@ -74,7 +74,7 @@
     </w:p>
     <w:p>
       <w:r>
-        <w:t>The task branch was created from the fetched origin/main at 40923b1. Repository guidance and docs/adr/0001-main-dev-branch-flow.md identify main as the released source of truth and dev as the integration branch, so main was selected as the base. The branch was pushed to GitHub after commit, and the linked branch page shows its files. An isolated worktree kept the unrelated changes in the original dev checkout untouched.</w:t>
+        <w:t>Repository guidance names main as the released source and dev as the integration branch. We created feature/advanced-seminar-agent-skills from origin/main at 40923b1 and pushed it to GitHub.</w:t>
       </w:r>
     </w:p>
     <w:p>
@@ -87,7 +87,7 @@
     </w:p>
     <w:p>
       <w:r>
-        <w:t>README.md, docs/ARCHITECTURE.md, and the existing root AGENTS.md were reviewed before editing. The root guidance keeps its frontend/backend, API contract, security, and workflow rules. A small Project skills section links contributors to the two focused LexChain skills and to the React/Next.js provider skill.</w:t>
+        <w:t>We reviewed README.md, docs/ARCHITECTURE.md, and the root AGENTS.md before editing. We added a Project skills section linking to the two LexChain skills and the Vercel skill. The existing frontend/backend, API, security, and workflow guidance remains.</w:t>
       </w:r>
     </w:p>
     <w:p>
@@ -103,7 +103,7 @@
         <w:pStyle w:val="ListBullet"/>
       </w:pPr>
       <w:r>
-        <w:t>lexchain-document-workflows gives a route-to-feature workflow for library, upload, review, lifecycle, verification, activity, and participant access. It keeps client role checks in the UI and backend authorization authoritative.</w:t>
+        <w:t>lexchain-document-workflows covers the document library, upload, review, lifecycle, verification, activity, and access flows. Frontend role checks guide the UI; the backend controls authorization.</w:t>
       </w:r>
     </w:p>
     <w:p>
@@ -111,7 +111,7 @@
         <w:pStyle w:val="ListBullet"/>
       </w:pPr>
       <w:r>
-        <w:t>lexchain-api-integration traces browser calls through shared clients and same-origin route handlers, and server-rendered or action calls through server-only backend helpers. It covers request/response contracts, cookies, validation, React Query behavior, and generated OpenAPI type boundaries.</w:t>
+        <w:t>lexchain-api-integration covers browser requests through the shared client and same-origin route handlers, plus server requests through server-only backend helpers. It preserves methods, payloads, headers, response and error contracts, cookies, and React Query behavior. Generated OpenAPI types must not be hand-edited.</w:t>
       </w:r>
     </w:p>
     <w:p>
@@ -124,11 +124,7 @@
     </w:p>
     <w:p>
       <w:r>
-        <w:rPr>
-          <w:rFonts w:ascii="Arial" w:hAnsi="Arial" w:eastAsia="Arial" w:cs="Arial"/>
-          <w:sz w:val="24"/>
-        </w:rPr>
-        <w:t>Vercel React Best Practices was installed as the single provider skill from Vercel Labs' vercel-labs/agent-skills repository. Its skill metadata identifies Vercel as author and MIT as its license; the included provider README preserves its acknowledgment that @shuding originally created the guidance at Vercel. The provider README declares MIT, but the upstream repository has no standalone LICENSE file; the project copy retains the available attribution and license metadata.</w:t>
+        <w:t>We installed Vercel React Best Practices from Vercel Labs agent-skills. Its metadata lists Vercel as author and MIT as the license. The README credits @shuding for the original guidance.</w:t>
       </w:r>
     </w:p>
     <w:p>
@@ -165,7 +161,7 @@
     </w:p>
     <w:p>
       <w:r>
-        <w:t>Installation used pnpm dlx skills add vercel-labs/agent-skills --skill vercel-react-best-practices --agent codex --copy --yes. The project copy is under .agents/skills/vercel-react-best-practices/ and skills-lock.json records its source and path.</w:t>
+        <w:t>Install command: pnpm dlx skills add vercel-labs/agent-skills --skill vercel-react-best-practices --agent codex --copy --yes. Files are in .agents/skills/vercel-react-best-practices/; skills-lock.json records the source and path.</w:t>
       </w:r>
     </w:p>
     <w:p>
@@ -178,12 +174,12 @@
     </w:p>
     <w:p>
       <w:r>
-        <w:t>The two LexChain skills and the installed provider skill passed the skill creator's quick_validate.py check. Markdown links, skill structure, screenshot readability, report font and rendering, and staged-file scope were checked. git diff --cached --check flags upstream trailing spaces in the provider copy’s AGENTS.md and rule pages; its SKILL.md and authored files are clean. Those provider source files were kept unchanged. No runtime code changed, so application tests and builds were not run. This editable DOCX preserves Arial 12 pt and the evidence images; a separate PDF was unnecessary.</w:t>
+        <w:t>All three skills passed quick_validate.py. We checked the Markdown links, skill files, screenshots, report formatting, and commit scope. The whitespace check found trailing spaces in unchanged provider files. We did not run application tests or a build because no runtime code changed.</w:t>
       </w:r>
     </w:p>
     <w:p>
       <w:r>
-        <w:t>Evidence screenshots are direct browser captures of GitHub pages on the pushed task branch. They show the branch and committed files, the skills directory, root AGENTS.md links, both LexChain skills, and the provider skill. Screenshots were not altered, and no credentials or tokens are visible.</w:t>
+        <w:t>These are direct GitHub screenshots from the task branch. They show the branch, skills folder, AGENTS.md links, and all three skills. The images are unedited and show no credentials or tokens.</w:t>
       </w:r>
     </w:p>
     <w:p>
@@ -243,7 +239,7 @@
         <w:jc w:val="center"/>
       </w:pPr>
       <w:r>
-        <w:t>Figure 1. GitHub branch page showing the pushed task branch and committed files.</w:t>
+        <w:t>Figure 1. GitHub branch and committed files.</w:t>
       </w:r>
     </w:p>
     <w:p>
@@ -294,7 +290,7 @@
         <w:jc w:val="center"/>
       </w:pPr>
       <w:r>
-        <w:t>Figure 2. GitHub .agents/skills directory listing the three project skills.</w:t>
+        <w:t>Figure 2. Three skills in the GitHub skills folder.</w:t>
       </w:r>
     </w:p>
     <w:p>
@@ -350,7 +346,7 @@
         <w:jc w:val="center"/>
       </w:pPr>
       <w:r>
-        <w:t>Figure 3. Root AGENTS.md Project skills section on GitHub.</w:t>
+        <w:t>Figure 3. Project skills links in AGENTS.md.</w:t>
       </w:r>
     </w:p>
     <w:p>
@@ -406,7 +402,7 @@
         <w:jc w:val="center"/>
       </w:pPr>
       <w:r>
-        <w:t>Figure 4. LexChain document workflows skill on GitHub.</w:t>
+        <w:t>Figure 4. lexchain-document-workflows on GitHub.</w:t>
       </w:r>
     </w:p>
     <w:p>
@@ -462,7 +458,7 @@
         <w:jc w:val="center"/>
       </w:pPr>
       <w:r>
-        <w:t>Figure 5. LexChain API integration skill on GitHub.</w:t>
+        <w:t>Figure 5. lexchain-api-integration on GitHub.</w:t>
       </w:r>
     </w:p>
     <w:p>
@@ -507,7 +503,7 @@
     <w:p>
       <w:pPr/>
       <w:r>
-        <w:t>Figure 6. Vercel React Best Practices provider skill on GitHub.</w:t>
+        <w:t>Figure 6. Vercel React Best Practices on GitHub.</w:t>
       </w:r>
     </w:p>
     <w:sectPr>

</xml_diff>

<commit_message>
docs: set seminar report text to black
</commit_message>
<xml_diff>
--- a/docs/advanced-seminar/LexChain-Advanced-Seminar.docx
+++ b/docs/advanced-seminar/LexChain-Advanced-Seminar.docx
@@ -12,6 +12,7 @@
           <w:rFonts w:ascii="Arial" w:hAnsi="Arial" w:eastAsia="Arial" w:cs="Arial"/>
           <w:b/>
           <w:sz w:val="24"/>
+          <w:color w:val="000000"/>
         </w:rPr>
         <w:t>LexChain Advanced Seminar</w:t>
       </w:r>
@@ -25,12 +26,16 @@
         <w:rPr>
           <w:rFonts w:ascii="Arial" w:hAnsi="Arial" w:eastAsia="Arial" w:cs="Arial"/>
           <w:sz w:val="24"/>
+          <w:color w:val="000000"/>
         </w:rPr>
         <w:t>Sean Agustine Esparagoza, Marvin Pescos, and Badygin Sinco</w:t>
       </w:r>
     </w:p>
     <w:p>
       <w:r>
+        <w:rPr>
+          <w:color w:val="000000"/>
+        </w:rPr>
         <w:t xml:space="preserve">Repository: </w:t>
       </w:r>
       <w:hyperlink r:id="rId9">
@@ -50,6 +55,9 @@
         <w:spacing w:after="160"/>
       </w:pPr>
       <w:r>
+        <w:rPr>
+          <w:color w:val="000000"/>
+        </w:rPr>
         <w:t xml:space="preserve">Task branch: </w:t>
       </w:r>
       <w:hyperlink r:id="rId10">
@@ -69,11 +77,17 @@
         <w:pStyle w:val="Heading1"/>
       </w:pPr>
       <w:r>
+        <w:rPr>
+          <w:color w:val="000000"/>
+        </w:rPr>
         <w:t>Branch and base</w:t>
       </w:r>
     </w:p>
     <w:p>
       <w:r>
+        <w:rPr>
+          <w:color w:val="000000"/>
+        </w:rPr>
         <w:t>Repository guidance names main as the released source and dev as the integration branch. We created feature/advanced-seminar-agent-skills from origin/main at 40923b1 and pushed it to GitHub.</w:t>
       </w:r>
     </w:p>
@@ -82,11 +96,17 @@
         <w:pStyle w:val="Heading1"/>
       </w:pPr>
       <w:r>
+        <w:rPr>
+          <w:color w:val="000000"/>
+        </w:rPr>
         <w:t>Agent guidance</w:t>
       </w:r>
     </w:p>
     <w:p>
       <w:r>
+        <w:rPr>
+          <w:color w:val="000000"/>
+        </w:rPr>
         <w:t>We reviewed README.md, docs/ARCHITECTURE.md, and the root AGENTS.md before editing. We added a Project skills section linking to the two LexChain skills and the Vercel skill. The existing frontend/backend, API, security, and workflow guidance remains.</w:t>
       </w:r>
     </w:p>
@@ -95,6 +115,9 @@
         <w:pStyle w:val="Heading1"/>
       </w:pPr>
       <w:r>
+        <w:rPr>
+          <w:color w:val="000000"/>
+        </w:rPr>
         <w:t>LexChain-specific skills</w:t>
       </w:r>
     </w:p>
@@ -103,6 +126,9 @@
         <w:pStyle w:val="ListBullet"/>
       </w:pPr>
       <w:r>
+        <w:rPr>
+          <w:color w:val="000000"/>
+        </w:rPr>
         <w:t>lexchain-document-workflows covers the document library, upload, review, lifecycle, verification, activity, and access flows. Frontend role checks guide the UI; the backend controls authorization.</w:t>
       </w:r>
     </w:p>
@@ -111,6 +137,9 @@
         <w:pStyle w:val="ListBullet"/>
       </w:pPr>
       <w:r>
+        <w:rPr>
+          <w:color w:val="000000"/>
+        </w:rPr>
         <w:t>lexchain-api-integration covers browser requests through the shared client and same-origin route handlers, plus server requests through server-only backend helpers. It preserves methods, payloads, headers, response and error contracts, cookies, and React Query behavior. Generated OpenAPI types must not be hand-edited.</w:t>
       </w:r>
     </w:p>
@@ -119,16 +148,25 @@
         <w:pStyle w:val="Heading1"/>
       </w:pPr>
       <w:r>
+        <w:rPr>
+          <w:color w:val="000000"/>
+        </w:rPr>
         <w:t>Provider skill</w:t>
       </w:r>
     </w:p>
     <w:p>
       <w:r>
+        <w:rPr>
+          <w:color w:val="000000"/>
+        </w:rPr>
         <w:t>We installed Vercel React Best Practices from Vercel Labs agent-skills. Its metadata lists Vercel as author and MIT as the license. The README credits @shuding for the original guidance.</w:t>
       </w:r>
     </w:p>
     <w:p>
       <w:r>
+        <w:rPr>
+          <w:color w:val="000000"/>
+        </w:rPr>
         <w:t xml:space="preserve">Source: </w:t>
       </w:r>
       <w:hyperlink r:id="rId11">
@@ -145,6 +183,9 @@
     </w:p>
     <w:p>
       <w:r>
+        <w:rPr>
+          <w:color w:val="000000"/>
+        </w:rPr>
         <w:t xml:space="preserve">Provider repository and license reference: </w:t>
       </w:r>
       <w:hyperlink r:id="rId12">
@@ -161,6 +202,9 @@
     </w:p>
     <w:p>
       <w:r>
+        <w:rPr>
+          <w:color w:val="000000"/>
+        </w:rPr>
         <w:t>Install command: pnpm dlx skills add vercel-labs/agent-skills --skill vercel-react-best-practices --agent codex --copy --yes. Files are in .agents/skills/vercel-react-best-practices/; skills-lock.json records the source and path.</w:t>
       </w:r>
     </w:p>
@@ -169,16 +213,25 @@
         <w:pStyle w:val="Heading1"/>
       </w:pPr>
       <w:r>
+        <w:rPr>
+          <w:color w:val="000000"/>
+        </w:rPr>
         <w:t>Verification</w:t>
       </w:r>
     </w:p>
     <w:p>
       <w:r>
+        <w:rPr>
+          <w:color w:val="000000"/>
+        </w:rPr>
         <w:t>All three skills passed quick_validate.py. We checked the Markdown links, skill files, screenshots, report formatting, and commit scope. The whitespace check found trailing spaces in unchanged provider files. We did not run application tests or a build because no runtime code changed.</w:t>
       </w:r>
     </w:p>
     <w:p>
       <w:r>
+        <w:rPr>
+          <w:color w:val="000000"/>
+        </w:rPr>
         <w:t>These are direct GitHub screenshots from the task branch. They show the branch, skills folder, AGENTS.md links, and all three skills. The images are unedited and show no credentials or tokens.</w:t>
       </w:r>
     </w:p>
@@ -188,6 +241,9 @@
         <w:pageBreakBefore/>
       </w:pPr>
       <w:r>
+        <w:rPr>
+          <w:color w:val="000000"/>
+        </w:rPr>
         <w:t>Evidence</w:t>
       </w:r>
     </w:p>
@@ -239,6 +295,9 @@
         <w:jc w:val="center"/>
       </w:pPr>
       <w:r>
+        <w:rPr>
+          <w:color w:val="000000"/>
+        </w:rPr>
         <w:t>Figure 1. GitHub branch and committed files.</w:t>
       </w:r>
     </w:p>
@@ -290,6 +349,9 @@
         <w:jc w:val="center"/>
       </w:pPr>
       <w:r>
+        <w:rPr>
+          <w:color w:val="000000"/>
+        </w:rPr>
         <w:t>Figure 2. Three skills in the GitHub skills folder.</w:t>
       </w:r>
     </w:p>
@@ -346,6 +408,9 @@
         <w:jc w:val="center"/>
       </w:pPr>
       <w:r>
+        <w:rPr>
+          <w:color w:val="000000"/>
+        </w:rPr>
         <w:t>Figure 3. Project skills links in AGENTS.md.</w:t>
       </w:r>
     </w:p>
@@ -402,6 +467,9 @@
         <w:jc w:val="center"/>
       </w:pPr>
       <w:r>
+        <w:rPr>
+          <w:color w:val="000000"/>
+        </w:rPr>
         <w:t>Figure 4. lexchain-document-workflows on GitHub.</w:t>
       </w:r>
     </w:p>
@@ -458,6 +526,9 @@
         <w:jc w:val="center"/>
       </w:pPr>
       <w:r>
+        <w:rPr>
+          <w:color w:val="000000"/>
+        </w:rPr>
         <w:t>Figure 5. lexchain-api-integration on GitHub.</w:t>
       </w:r>
     </w:p>
@@ -503,6 +574,9 @@
     <w:p>
       <w:pPr/>
       <w:r>
+        <w:rPr>
+          <w:color w:val="000000"/>
+        </w:rPr>
         <w:t>Figure 6. Vercel React Best Practices on GitHub.</w:t>
       </w:r>
     </w:p>
@@ -957,7 +1031,7 @@
       <w:rFonts w:asciiTheme="majorHAnsi" w:eastAsiaTheme="majorEastAsia" w:hAnsiTheme="majorHAnsi" w:cstheme="majorBidi" w:ascii="Arial" w:hAnsi="Arial" w:eastAsia="Arial" w:cs="Arial"/>
       <w:b/>
       <w:bCs/>
-      <w:color w:val="365F91" w:themeColor="accent1" w:themeShade="BF"/>
+      <w:color w:val="000000"/>
       <w:sz w:val="24"/>
       <w:szCs w:val="28"/>
     </w:rPr>

</xml_diff>